<commit_message>
cohort 1 LANDED (private_credit end-to-end): R1-verified roster (8 new registry entries incl. Neostellar rename catch + roster_decisions.md exclusion log), bcred+pflex cohort-tier extraction (82 cells, adversarially verified, 100% resolved), quarterly-NAV series tier, cohort engine (R4 phrasing gates, composite refusal law, caveat matrix as data) + 16 unit tests, lane C first honest near-miss (peer cohort 7/12 outranked), facts at 14 w/ cohort_id/depth/rationale, PFLEX/ARKVX/NSLR daily series, memos regenerated
Co-Authored-By: Claude Fable 5 <noreply@anthropic.com>
</commit_message>
<xml_diff>
--- a/data/memos/cliffwater_cclfx_decision_memo.docx
+++ b/data/memos/cliffwater_cclfx_decision_memo.docx
@@ -23,7 +23,7 @@
         <w:br/>
       </w:r>
       <w:r>
-        <w:t>Date: 2026-08-09    Status: DRAFT — demo build; cells marked extracted-unverified pend independent verification.</w:t>
+        <w:t>Date: 2026-08-15    Status: DRAFT — demo build; cells marked extracted-unverified pend independent verification.</w:t>
       </w:r>
     </w:p>
     <w:p>
@@ -430,6 +430,38 @@
           </w:tcPr>
           <w:p>
             <w:r>
+              <w:t>Peer cohort: private_credit (cclfx, bcred, pflex)</w:t>
+            </w:r>
+          </w:p>
+        </w:tc>
+        <w:tc>
+          <w:tcPr>
+            <w:tcW w:type="dxa" w:w="1152"/>
+          </w:tcPr>
+          <w:p>
+            <w:r>
+              <w:t>7/12</w:t>
+            </w:r>
+          </w:p>
+        </w:tc>
+        <w:tc>
+          <w:tcPr>
+            <w:tcW w:type="dxa" w:w="4752"/>
+          </w:tcPr>
+          <w:p>
+            <w:r>
+              <w:t>outranked: score 7/12 vs primary 9/12 and secondary 9/12 - only two slots; retained in log as viable alternate</w:t>
+            </w:r>
+          </w:p>
+        </w:tc>
+      </w:tr>
+      <w:tr>
+        <w:tc>
+          <w:tcPr>
+            <w:tcW w:type="dxa" w:w="3456"/>
+          </w:tcPr>
+          <w:p>
+            <w:r>
               <w:t>Cliffwater Direct Lending Index (CDLI)</w:t>
             </w:r>
           </w:p>
@@ -451,38 +483,6 @@
           <w:p>
             <w:r>
               <w:t>score 6/12 below primary threshold 7</w:t>
-            </w:r>
-          </w:p>
-        </w:tc>
-      </w:tr>
-      <w:tr>
-        <w:tc>
-          <w:tcPr>
-            <w:tcW w:type="dxa" w:w="3456"/>
-          </w:tcPr>
-          <w:p>
-            <w:r>
-              <w:t>Peer cohort: same-strategy interval credit funds</w:t>
-            </w:r>
-          </w:p>
-        </w:tc>
-        <w:tc>
-          <w:tcPr>
-            <w:tcW w:type="dxa" w:w="1152"/>
-          </w:tcPr>
-          <w:p>
-            <w:r>
-              <w:t>5/12</w:t>
-            </w:r>
-          </w:p>
-        </w:tc>
-        <w:tc>
-          <w:tcPr>
-            <w:tcW w:type="dxa" w:w="4752"/>
-          </w:tcPr>
-          <w:p>
-            <w:r>
-              <w:t>score 5/12 below primary threshold 7</w:t>
             </w:r>
           </w:p>
         </w:tc>

</xml_diff>